<commit_message>
upload database explanation and sql files
</commit_message>
<xml_diff>
--- a/UgurBastug_NovaStore_Proje.docx
+++ b/UgurBastug_NovaStore_Proje.docx
@@ -26,9 +26,6 @@
         <w:pStyle w:val="Normal"/>
         <w:spacing w:before="0" w:after="480"/>
         <w:jc w:val="center"/>
-        <w:rPr/>
-      </w:pPr>
-      <w:r>
         <w:rPr>
           <w:rFonts w:eastAsia="Arial" w:cs="Arial"/>
           <w:b w:val="false"/>
@@ -37,7 +34,45 @@
           <w:sz w:val="32"/>
           <w:szCs w:val="32"/>
         </w:rPr>
+      </w:pPr>
+      <w:r>
+        <w:rPr>
+          <w:rFonts w:eastAsia="Arial" w:cs="Arial"/>
+          <w:b w:val="false"/>
+          <w:bCs w:val="false"/>
+          <w:color w:val="7F8C8D"/>
+          <w:sz w:val="32"/>
+          <w:szCs w:val="32"/>
+        </w:rPr>
         <w:t>Veri Yönetim Sistemi Proje Raporu</w:t>
+      </w:r>
+    </w:p>
+    <w:p>
+      <w:pPr>
+        <w:pStyle w:val="Normal"/>
+        <w:spacing w:before="0" w:after="480"/>
+        <w:jc w:val="start"/>
+        <w:rPr>
+          <w:rFonts w:eastAsia="Arial" w:cs="Arial"/>
+          <w:b w:val="false"/>
+          <w:bCs w:val="false"/>
+          <w:color w:val="7F8C8D"/>
+          <w:sz w:val="32"/>
+          <w:szCs w:val="32"/>
+          <w:lang w:val="tr-TR"/>
+        </w:rPr>
+      </w:pPr>
+      <w:r>
+        <w:rPr>
+          <w:rFonts w:eastAsia="Arial" w:cs="Arial"/>
+          <w:b w:val="false"/>
+          <w:bCs w:val="false"/>
+          <w:color w:val="7F8C8D"/>
+          <w:sz w:val="32"/>
+          <w:szCs w:val="32"/>
+          <w:lang w:val="tr-TR"/>
+        </w:rPr>
+        <w:t>Önemli not: Sorgular ve Tablolar PosgreSQL ile yazılmıştır.</w:t>
       </w:r>
     </w:p>
     <w:p>
@@ -1020,7 +1055,7 @@
           <w:sz w:val="22"/>
           <w:szCs w:val="22"/>
         </w:rPr>
-        <w:t>[ Ekran Görüntüsü: Tüm tabloların ilişkisel yapısı (ER Diyagramı) ]</w:t>
+        <w:t>Tüm tabloların ilişkisel yapısı (ER Diyagramı)</w:t>
       </w:r>
     </w:p>
     <w:p>
@@ -1054,7 +1089,7 @@
           <w:szCs w:val="22"/>
         </w:rPr>
         <w:drawing>
-          <wp:anchor distT="0" distB="0" distL="0" distR="0" simplePos="0" relativeHeight="9" behindDoc="0" locked="0" layoutInCell="0" allowOverlap="1">
+          <wp:anchor distT="0" distB="0" distL="0" distR="0" simplePos="0" relativeHeight="8" behindDoc="0" locked="0" layoutInCell="0" allowOverlap="1">
             <wp:simplePos x="0" y="0"/>
             <wp:positionH relativeFrom="column">
               <wp:posOffset>808355</wp:posOffset>
@@ -1656,38 +1691,6 @@
     </w:p>
     <w:p>
       <w:pPr>
-        <w:pStyle w:val="Normal"/>
-        <w:pBdr>
-          <w:top w:val="dashed" w:sz="4" w:space="0" w:color="CCCCCC"/>
-          <w:left w:val="dashed" w:sz="4" w:space="0" w:color="CCCCCC"/>
-          <w:right w:val="dashed" w:sz="4" w:space="0" w:color="CCCCCC"/>
-        </w:pBdr>
-        <w:shd w:val="clear" w:fill="FAFAFA"/>
-        <w:spacing w:before="120" w:after="200"/>
-        <w:ind w:hanging="0" w:start="0" w:end="400"/>
-        <w:jc w:val="center"/>
-        <w:rPr>
-          <w:rFonts w:eastAsia="Arial" w:cs="Arial"/>
-          <w:i/>
-          <w:iCs/>
-          <w:color w:val="999999"/>
-          <w:sz w:val="22"/>
-          <w:szCs w:val="22"/>
-        </w:rPr>
-      </w:pPr>
-      <w:r>
-        <w:rPr>
-          <w:rFonts w:eastAsia="Arial" w:cs="Arial"/>
-          <w:i/>
-          <w:iCs/>
-          <w:color w:val="999999"/>
-          <w:sz w:val="22"/>
-          <w:szCs w:val="22"/>
-        </w:rPr>
-      </w:r>
-    </w:p>
-    <w:p>
-      <w:pPr>
         <w:pStyle w:val="Heading1"/>
         <w:spacing w:before="400" w:after="160"/>
         <w:rPr/>
@@ -1857,7 +1860,7 @@
           <w:sz w:val="22"/>
           <w:szCs w:val="22"/>
         </w:rPr>
-        <w:t>[ Ekran Görüntüsü: Sorgu 1 Sonucu ]</w:t>
+        <w:t>Sorgu 1 Sonucu</w:t>
       </w:r>
     </w:p>
     <w:p>
@@ -1890,46 +1893,14 @@
           <w:sz w:val="22"/>
           <w:szCs w:val="22"/>
         </w:rPr>
-      </w:r>
-    </w:p>
-    <w:p>
-      <w:pPr>
-        <w:pStyle w:val="Normal"/>
-        <w:pBdr>
-          <w:top w:val="dashed" w:sz="4" w:space="0" w:color="CCCCCC"/>
-          <w:left w:val="dashed" w:sz="4" w:space="0" w:color="CCCCCC"/>
-          <w:right w:val="dashed" w:sz="4" w:space="0" w:color="CCCCCC"/>
-        </w:pBdr>
-        <w:shd w:val="clear" w:fill="FAFAFA"/>
-        <w:spacing w:before="120" w:after="200"/>
-        <w:ind w:start="400" w:end="400"/>
-        <w:jc w:val="center"/>
-        <w:rPr>
-          <w:rFonts w:ascii="Arial" w:hAnsi="Arial" w:eastAsia="Arial" w:cs="Arial"/>
-          <w:i/>
-          <w:iCs/>
-          <w:color w:val="999999"/>
-          <w:sz w:val="22"/>
-          <w:szCs w:val="22"/>
-        </w:rPr>
-      </w:pPr>
-      <w:r>
-        <w:rPr>
-          <w:rFonts w:eastAsia="Arial" w:cs="Arial"/>
-          <w:i/>
-          <w:iCs/>
-          <w:color w:val="999999"/>
-          <w:sz w:val="22"/>
-          <w:szCs w:val="22"/>
-        </w:rPr>
         <w:drawing>
           <wp:anchor distT="0" distB="0" distL="0" distR="0" simplePos="0" relativeHeight="2" behindDoc="0" locked="0" layoutInCell="0" allowOverlap="1">
             <wp:simplePos x="0" y="0"/>
             <wp:positionH relativeFrom="column">
-              <wp:posOffset>1323340</wp:posOffset>
+              <wp:posOffset>1447165</wp:posOffset>
             </wp:positionH>
             <wp:positionV relativeFrom="paragraph">
-              <wp:posOffset>76835</wp:posOffset>
+              <wp:posOffset>-113030</wp:posOffset>
             </wp:positionV>
             <wp:extent cx="3019425" cy="838200"/>
             <wp:effectExtent l="0" t="0" r="0" b="0"/>
@@ -2036,38 +2007,6 @@
     </w:p>
     <w:p>
       <w:pPr>
-        <w:pStyle w:val="Normal"/>
-        <w:pBdr>
-          <w:top w:val="dashed" w:sz="4" w:space="0" w:color="CCCCCC"/>
-          <w:left w:val="dashed" w:sz="4" w:space="0" w:color="CCCCCC"/>
-          <w:right w:val="dashed" w:sz="4" w:space="0" w:color="CCCCCC"/>
-        </w:pBdr>
-        <w:shd w:val="clear" w:fill="FAFAFA"/>
-        <w:spacing w:before="120" w:after="200"/>
-        <w:ind w:start="400" w:end="400"/>
-        <w:jc w:val="center"/>
-        <w:rPr>
-          <w:rFonts w:ascii="Arial" w:hAnsi="Arial" w:eastAsia="Arial" w:cs="Arial"/>
-          <w:i/>
-          <w:iCs/>
-          <w:color w:val="999999"/>
-          <w:sz w:val="22"/>
-          <w:szCs w:val="22"/>
-        </w:rPr>
-      </w:pPr>
-      <w:r>
-        <w:rPr>
-          <w:rFonts w:eastAsia="Arial" w:cs="Arial"/>
-          <w:i/>
-          <w:iCs/>
-          <w:color w:val="999999"/>
-          <w:sz w:val="22"/>
-          <w:szCs w:val="22"/>
-        </w:rPr>
-      </w:r>
-    </w:p>
-    <w:p>
-      <w:pPr>
         <w:pStyle w:val="Heading2"/>
         <w:spacing w:before="320" w:after="120"/>
         <w:rPr/>
@@ -2190,58 +2129,31 @@
           <w:sz w:val="22"/>
           <w:szCs w:val="22"/>
         </w:rPr>
-        <w:t xml:space="preserve">[ Ekran Görüntüsü: Sorgu 2 Sonucu </w:t>
-      </w:r>
-      <w:r>
-        <w:rPr>
-          <w:rFonts w:eastAsia="Arial" w:cs="Arial"/>
-          <w:i/>
-          <w:iCs/>
-          <w:color w:val="999999"/>
-          <w:sz w:val="26"/>
-          <w:szCs w:val="26"/>
-        </w:rPr>
-        <w:t>]</w:t>
-      </w:r>
-    </w:p>
-    <w:p>
-      <w:pPr>
-        <w:pStyle w:val="Normal"/>
-        <w:pBdr>
-          <w:top w:val="dashed" w:sz="4" w:space="0" w:color="CCCCCC"/>
-          <w:left w:val="dashed" w:sz="4" w:space="0" w:color="CCCCCC"/>
-          <w:right w:val="dashed" w:sz="4" w:space="0" w:color="CCCCCC"/>
-        </w:pBdr>
-        <w:shd w:val="clear" w:fill="FAFAFA"/>
-        <w:spacing w:before="120" w:after="200"/>
-        <w:ind w:hanging="0" w:start="0" w:end="400"/>
-        <w:jc w:val="center"/>
-        <w:rPr>
-          <w:rFonts w:ascii="Arial" w:hAnsi="Arial" w:eastAsia="Arial" w:cs="Arial"/>
-          <w:i/>
-          <w:iCs/>
-          <w:color w:val="999999"/>
-          <w:sz w:val="26"/>
-          <w:szCs w:val="26"/>
-        </w:rPr>
-      </w:pPr>
-      <w:r>
-        <w:rPr>
-          <w:rFonts w:eastAsia="Arial" w:cs="Arial"/>
-          <w:i/>
-          <w:iCs/>
-          <w:color w:val="999999"/>
-          <w:sz w:val="26"/>
-          <w:szCs w:val="26"/>
-        </w:rPr>
+        <w:t>Sorgu 2 Sonucu</w:t>
+      </w:r>
+    </w:p>
+    <w:p>
+      <w:pPr>
+        <w:pStyle w:val="Heading2"/>
+        <w:spacing w:before="320" w:after="120"/>
+        <w:rPr>
+          <w:rFonts w:eastAsia="Arial" w:cs="Arial"/>
+          <w:b/>
+          <w:bCs/>
+          <w:color w:val="2980B9"/>
+          <w:sz w:val="24"/>
+          <w:szCs w:val="24"/>
+        </w:rPr>
+      </w:pPr>
+      <w:r>
         <w:drawing>
           <wp:anchor distT="0" distB="0" distL="0" distR="0" simplePos="0" relativeHeight="3" behindDoc="0" locked="0" layoutInCell="0" allowOverlap="1">
             <wp:simplePos x="0" y="0"/>
             <wp:positionH relativeFrom="column">
-              <wp:posOffset>308610</wp:posOffset>
+              <wp:posOffset>356235</wp:posOffset>
             </wp:positionH>
             <wp:positionV relativeFrom="paragraph">
-              <wp:posOffset>60325</wp:posOffset>
+              <wp:posOffset>-87630</wp:posOffset>
             </wp:positionV>
             <wp:extent cx="5034280" cy="1907540"/>
             <wp:effectExtent l="0" t="0" r="0" b="0"/>
@@ -2281,45 +2193,6 @@
           </wp:anchor>
         </w:drawing>
       </w:r>
-    </w:p>
-    <w:p>
-      <w:pPr>
-        <w:pStyle w:val="Normal"/>
-        <w:pBdr>
-          <w:top w:val="dashed" w:sz="4" w:space="0" w:color="CCCCCC"/>
-          <w:left w:val="dashed" w:sz="4" w:space="0" w:color="CCCCCC"/>
-          <w:right w:val="dashed" w:sz="4" w:space="0" w:color="CCCCCC"/>
-        </w:pBdr>
-        <w:shd w:val="clear" w:fill="FAFAFA"/>
-        <w:spacing w:before="120" w:after="200"/>
-        <w:ind w:start="400" w:end="400"/>
-        <w:jc w:val="center"/>
-        <w:rPr>
-          <w:rFonts w:ascii="Arial" w:hAnsi="Arial" w:eastAsia="Arial" w:cs="Arial"/>
-          <w:i/>
-          <w:iCs/>
-          <w:color w:val="999999"/>
-          <w:sz w:val="26"/>
-          <w:szCs w:val="26"/>
-        </w:rPr>
-      </w:pPr>
-      <w:r>
-        <w:rPr>
-          <w:rFonts w:eastAsia="Arial" w:cs="Arial"/>
-          <w:i/>
-          <w:iCs/>
-          <w:color w:val="999999"/>
-          <w:sz w:val="26"/>
-          <w:szCs w:val="26"/>
-        </w:rPr>
-      </w:r>
-    </w:p>
-    <w:p>
-      <w:pPr>
-        <w:pStyle w:val="Heading2"/>
-        <w:spacing w:before="320" w:after="120"/>
-        <w:rPr/>
-      </w:pPr>
       <w:r>
         <w:rPr>
           <w:rFonts w:eastAsia="Arial" w:cs="Arial"/>
@@ -2533,7 +2406,7 @@
           <w:sz w:val="22"/>
           <w:szCs w:val="22"/>
         </w:rPr>
-        <w:t>[ Ekran Görüntüsü: Sorgu 3 Sonucu ]</w:t>
+        <w:t>Sorgu 3 Sonucu</w:t>
       </w:r>
     </w:p>
     <w:p>
@@ -2616,38 +2489,6 @@
     </w:p>
     <w:p>
       <w:pPr>
-        <w:pStyle w:val="Normal"/>
-        <w:pBdr>
-          <w:top w:val="dashed" w:sz="4" w:space="0" w:color="CCCCCC"/>
-          <w:left w:val="dashed" w:sz="4" w:space="0" w:color="CCCCCC"/>
-          <w:right w:val="dashed" w:sz="4" w:space="0" w:color="CCCCCC"/>
-        </w:pBdr>
-        <w:shd w:val="clear" w:fill="FAFAFA"/>
-        <w:spacing w:before="120" w:after="200"/>
-        <w:ind w:start="400" w:end="400"/>
-        <w:jc w:val="center"/>
-        <w:rPr>
-          <w:rFonts w:ascii="Arial" w:hAnsi="Arial" w:eastAsia="Arial" w:cs="Arial"/>
-          <w:i/>
-          <w:iCs/>
-          <w:color w:val="999999"/>
-          <w:sz w:val="22"/>
-          <w:szCs w:val="22"/>
-        </w:rPr>
-      </w:pPr>
-      <w:r>
-        <w:rPr>
-          <w:rFonts w:eastAsia="Arial" w:cs="Arial"/>
-          <w:i/>
-          <w:iCs/>
-          <w:color w:val="999999"/>
-          <w:sz w:val="22"/>
-          <w:szCs w:val="22"/>
-        </w:rPr>
-      </w:r>
-    </w:p>
-    <w:p>
-      <w:pPr>
         <w:pStyle w:val="Heading2"/>
         <w:spacing w:before="320" w:after="120"/>
         <w:rPr/>
@@ -2677,7 +2518,26 @@
           <w:sz w:val="22"/>
           <w:szCs w:val="22"/>
         </w:rPr>
-        <w:t>Her kategorideki toplam stok miktarı hesaplanmaktadır. GROUP BY ve SUM aggregate fonksiyonu kullanılmıştır.</w:t>
+        <w:t xml:space="preserve">Her kategorideki toplam stok miktarı hesaplanmaktadır. GROUP BY ve </w:t>
+      </w:r>
+      <w:r>
+        <w:rPr>
+          <w:rFonts w:eastAsia="Arial" w:cs="Arial"/>
+          <w:color w:val="444444"/>
+          <w:sz w:val="22"/>
+          <w:szCs w:val="22"/>
+          <w:lang w:val="tr-TR"/>
+        </w:rPr>
+        <w:t>COUNT</w:t>
+      </w:r>
+      <w:r>
+        <w:rPr>
+          <w:rFonts w:eastAsia="Arial" w:cs="Arial"/>
+          <w:color w:val="444444"/>
+          <w:sz w:val="22"/>
+          <w:szCs w:val="22"/>
+        </w:rPr>
+        <w:t xml:space="preserve"> aggregate fonksiyonu kullanılmıştır.</w:t>
       </w:r>
     </w:p>
     <w:p>
@@ -2700,7 +2560,26 @@
           <w:sz w:val="18"/>
           <w:szCs w:val="18"/>
         </w:rPr>
-        <w:t>SELECT categories.category_name, SUM(stock)</w:t>
+        <w:t xml:space="preserve">SELECT categories.category_name, </w:t>
+      </w:r>
+      <w:r>
+        <w:rPr>
+          <w:rFonts w:eastAsia="Courier New" w:cs="Courier New" w:ascii="Courier New" w:hAnsi="Courier New"/>
+          <w:color w:val="1E1E1E"/>
+          <w:sz w:val="18"/>
+          <w:szCs w:val="18"/>
+          <w:lang w:val="tr-TR"/>
+        </w:rPr>
+        <w:t>COUNT</w:t>
+      </w:r>
+      <w:r>
+        <w:rPr>
+          <w:rFonts w:eastAsia="Courier New" w:cs="Courier New" w:ascii="Courier New" w:hAnsi="Courier New"/>
+          <w:color w:val="1E1E1E"/>
+          <w:sz w:val="18"/>
+          <w:szCs w:val="18"/>
+        </w:rPr>
+        <w:t>(stock)</w:t>
       </w:r>
     </w:p>
     <w:p>
@@ -2788,18 +2667,19 @@
           <w:color w:val="999999"/>
           <w:sz w:val="22"/>
           <w:szCs w:val="22"/>
-        </w:rPr>
-      </w:pPr>
-      <w:r>
-        <w:rPr>
-          <w:rFonts w:eastAsia="Arial" w:cs="Arial"/>
-          <w:i/>
-          <w:iCs/>
-          <w:color w:val="999999"/>
-          <w:sz w:val="22"/>
-          <w:szCs w:val="22"/>
-        </w:rPr>
-        <w:t>[ Ekran Görüntüsü: Sorgu 4 Sonucu ]</w:t>
+          <w:lang w:val="tr-TR"/>
+        </w:rPr>
+      </w:pPr>
+      <w:r>
+        <w:rPr>
+          <w:rFonts w:eastAsia="Arial" w:cs="Arial"/>
+          <w:i/>
+          <w:iCs/>
+          <w:color w:val="999999"/>
+          <w:sz w:val="22"/>
+          <w:szCs w:val="22"/>
+          <w:lang w:val="tr-TR"/>
+        </w:rPr>
       </w:r>
     </w:p>
     <w:p>
@@ -2864,16 +2744,81 @@
           <w:sz w:val="22"/>
           <w:szCs w:val="22"/>
         </w:rPr>
+      </w:r>
+    </w:p>
+    <w:p>
+      <w:pPr>
+        <w:pStyle w:val="Normal"/>
+        <w:pBdr>
+          <w:top w:val="dashed" w:sz="4" w:space="0" w:color="CCCCCC"/>
+          <w:left w:val="dashed" w:sz="4" w:space="0" w:color="CCCCCC"/>
+          <w:right w:val="dashed" w:sz="4" w:space="0" w:color="CCCCCC"/>
+        </w:pBdr>
+        <w:shd w:val="clear" w:fill="FAFAFA"/>
+        <w:spacing w:before="120" w:after="200"/>
+        <w:ind w:start="400" w:end="400"/>
+        <w:jc w:val="center"/>
+        <w:rPr>
+          <w:rFonts w:ascii="Arial" w:hAnsi="Arial" w:eastAsia="Arial" w:cs="Arial"/>
+          <w:i/>
+          <w:iCs/>
+          <w:color w:val="999999"/>
+          <w:sz w:val="22"/>
+          <w:szCs w:val="22"/>
+          <w:lang w:val="tr-TR"/>
+        </w:rPr>
+      </w:pPr>
+      <w:r>
+        <w:rPr/>
+        <w:t>Sorgu 4 Sonuc</w:t>
+      </w:r>
+      <w:r>
+        <w:rPr>
+          <w:lang w:val="tr-TR"/>
+        </w:rPr>
+        <w:t>u</w:t>
+      </w:r>
+    </w:p>
+    <w:p>
+      <w:pPr>
+        <w:pStyle w:val="Normal"/>
+        <w:pBdr>
+          <w:top w:val="dashed" w:sz="4" w:space="0" w:color="CCCCCC"/>
+          <w:left w:val="dashed" w:sz="4" w:space="0" w:color="CCCCCC"/>
+          <w:right w:val="dashed" w:sz="4" w:space="0" w:color="CCCCCC"/>
+        </w:pBdr>
+        <w:shd w:val="clear" w:fill="FAFAFA"/>
+        <w:spacing w:before="120" w:after="200"/>
+        <w:ind w:hanging="0" w:start="0" w:end="400"/>
+        <w:jc w:val="center"/>
+        <w:rPr>
+          <w:rFonts w:ascii="Arial" w:hAnsi="Arial" w:eastAsia="Arial" w:cs="Arial"/>
+          <w:i/>
+          <w:iCs/>
+          <w:color w:val="999999"/>
+          <w:sz w:val="22"/>
+          <w:szCs w:val="22"/>
+        </w:rPr>
+      </w:pPr>
+      <w:r>
+        <w:rPr>
+          <w:rFonts w:eastAsia="Arial" w:cs="Arial"/>
+          <w:i/>
+          <w:iCs/>
+          <w:color w:val="999999"/>
+          <w:sz w:val="22"/>
+          <w:szCs w:val="22"/>
+        </w:rPr>
         <w:drawing>
-          <wp:anchor distT="0" distB="0" distL="0" distR="0" simplePos="0" relativeHeight="5" behindDoc="0" locked="0" layoutInCell="0" allowOverlap="1">
+          <wp:anchor distT="0" distB="0" distL="0" distR="0" simplePos="0" relativeHeight="9" behindDoc="0" locked="0" layoutInCell="0" allowOverlap="1">
             <wp:simplePos x="0" y="0"/>
             <wp:positionH relativeFrom="column">
-              <wp:posOffset>1304290</wp:posOffset>
+              <wp:posOffset>1384935</wp:posOffset>
             </wp:positionH>
             <wp:positionV relativeFrom="paragraph">
-              <wp:posOffset>-74295</wp:posOffset>
+              <wp:posOffset>363220</wp:posOffset>
             </wp:positionV>
-            <wp:extent cx="2771775" cy="1133475"/>
+            <wp:extent cx="2809875" cy="1200150"/>
             <wp:effectExtent l="0" t="0" r="0" b="0"/>
             <wp:wrapSquare wrapText="largest"/>
             <wp:docPr id="5" name="Image4"/>
@@ -2898,7 +2843,7 @@
                   <pic:spPr bwMode="auto">
                     <a:xfrm>
                       <a:off x="0" y="0"/>
-                      <a:ext cx="2771775" cy="1133475"/>
+                      <a:ext cx="2809875" cy="1200150"/>
                     </a:xfrm>
                     <a:prstGeom prst="rect">
                       <a:avLst/>
@@ -2914,139 +2859,8 @@
     </w:p>
     <w:p>
       <w:pPr>
-        <w:pStyle w:val="Normal"/>
-        <w:pBdr>
-          <w:top w:val="dashed" w:sz="4" w:space="0" w:color="CCCCCC"/>
-          <w:left w:val="dashed" w:sz="4" w:space="0" w:color="CCCCCC"/>
-          <w:right w:val="dashed" w:sz="4" w:space="0" w:color="CCCCCC"/>
-        </w:pBdr>
-        <w:shd w:val="clear" w:fill="FAFAFA"/>
-        <w:spacing w:before="120" w:after="200"/>
-        <w:ind w:start="400" w:end="400"/>
-        <w:jc w:val="center"/>
-        <w:rPr>
-          <w:rFonts w:ascii="Arial" w:hAnsi="Arial" w:eastAsia="Arial" w:cs="Arial"/>
-          <w:i/>
-          <w:iCs/>
-          <w:color w:val="999999"/>
-          <w:sz w:val="22"/>
-          <w:szCs w:val="22"/>
-        </w:rPr>
-      </w:pPr>
-      <w:r>
-        <w:rPr>
-          <w:rFonts w:eastAsia="Arial" w:cs="Arial"/>
-          <w:i/>
-          <w:iCs/>
-          <w:color w:val="999999"/>
-          <w:sz w:val="22"/>
-          <w:szCs w:val="22"/>
-        </w:rPr>
-      </w:r>
-    </w:p>
-    <w:p>
-      <w:pPr>
-        <w:pStyle w:val="Normal"/>
-        <w:pBdr>
-          <w:top w:val="dashed" w:sz="4" w:space="0" w:color="CCCCCC"/>
-          <w:left w:val="dashed" w:sz="4" w:space="0" w:color="CCCCCC"/>
-          <w:right w:val="dashed" w:sz="4" w:space="0" w:color="CCCCCC"/>
-        </w:pBdr>
-        <w:shd w:val="clear" w:fill="FAFAFA"/>
-        <w:spacing w:before="120" w:after="200"/>
-        <w:ind w:start="400" w:end="400"/>
-        <w:jc w:val="center"/>
-        <w:rPr>
-          <w:rFonts w:ascii="Arial" w:hAnsi="Arial" w:eastAsia="Arial" w:cs="Arial"/>
-          <w:i/>
-          <w:iCs/>
-          <w:color w:val="999999"/>
-          <w:sz w:val="22"/>
-          <w:szCs w:val="22"/>
-        </w:rPr>
-      </w:pPr>
-      <w:r>
-        <w:rPr>
-          <w:rFonts w:eastAsia="Arial" w:cs="Arial"/>
-          <w:i/>
-          <w:iCs/>
-          <w:color w:val="999999"/>
-          <w:sz w:val="22"/>
-          <w:szCs w:val="22"/>
-        </w:rPr>
-      </w:r>
-    </w:p>
-    <w:p>
-      <w:pPr>
-        <w:pStyle w:val="Normal"/>
-        <w:pBdr>
-          <w:top w:val="dashed" w:sz="4" w:space="0" w:color="CCCCCC"/>
-          <w:left w:val="dashed" w:sz="4" w:space="0" w:color="CCCCCC"/>
-          <w:right w:val="dashed" w:sz="4" w:space="0" w:color="CCCCCC"/>
-        </w:pBdr>
-        <w:shd w:val="clear" w:fill="FAFAFA"/>
-        <w:spacing w:before="120" w:after="200"/>
-        <w:ind w:start="400" w:end="400"/>
-        <w:jc w:val="center"/>
-        <w:rPr>
-          <w:rFonts w:ascii="Arial" w:hAnsi="Arial" w:eastAsia="Arial" w:cs="Arial"/>
-          <w:i/>
-          <w:iCs/>
-          <w:color w:val="999999"/>
-          <w:sz w:val="22"/>
-          <w:szCs w:val="22"/>
-        </w:rPr>
-      </w:pPr>
-      <w:r>
-        <w:rPr>
-          <w:rFonts w:eastAsia="Arial" w:cs="Arial"/>
-          <w:i/>
-          <w:iCs/>
-          <w:color w:val="999999"/>
-          <w:sz w:val="22"/>
-          <w:szCs w:val="22"/>
-        </w:rPr>
-      </w:r>
-    </w:p>
-    <w:p>
-      <w:pPr>
-        <w:pStyle w:val="Normal"/>
-        <w:pBdr>
-          <w:top w:val="dashed" w:sz="4" w:space="0" w:color="CCCCCC"/>
-          <w:left w:val="dashed" w:sz="4" w:space="0" w:color="CCCCCC"/>
-          <w:right w:val="dashed" w:sz="4" w:space="0" w:color="CCCCCC"/>
-        </w:pBdr>
-        <w:shd w:val="clear" w:fill="FAFAFA"/>
-        <w:spacing w:before="120" w:after="200"/>
-        <w:ind w:start="400" w:end="400"/>
-        <w:jc w:val="center"/>
-        <w:rPr>
-          <w:rFonts w:ascii="Arial" w:hAnsi="Arial" w:eastAsia="Arial" w:cs="Arial"/>
-          <w:i/>
-          <w:iCs/>
-          <w:color w:val="999999"/>
-          <w:sz w:val="22"/>
-          <w:szCs w:val="22"/>
-        </w:rPr>
-      </w:pPr>
-      <w:r>
-        <w:rPr>
-          <w:rFonts w:eastAsia="Arial" w:cs="Arial"/>
-          <w:i/>
-          <w:iCs/>
-          <w:color w:val="999999"/>
-          <w:sz w:val="22"/>
-          <w:szCs w:val="22"/>
-        </w:rPr>
-      </w:r>
-    </w:p>
-    <w:p>
-      <w:pPr>
         <w:pStyle w:val="Heading2"/>
         <w:spacing w:before="320" w:after="120"/>
-        <w:rPr/>
-      </w:pPr>
-      <w:r>
         <w:rPr>
           <w:rFonts w:eastAsia="Arial" w:cs="Arial"/>
           <w:b/>
@@ -3055,6 +2869,112 @@
           <w:sz w:val="24"/>
           <w:szCs w:val="24"/>
         </w:rPr>
+      </w:pPr>
+      <w:r>
+        <w:rPr>
+          <w:rFonts w:eastAsia="Arial" w:cs="Arial"/>
+          <w:b/>
+          <w:bCs/>
+          <w:color w:val="2980B9"/>
+          <w:sz w:val="24"/>
+          <w:szCs w:val="24"/>
+        </w:rPr>
+      </w:r>
+    </w:p>
+    <w:p>
+      <w:pPr>
+        <w:pStyle w:val="Heading2"/>
+        <w:spacing w:before="320" w:after="120"/>
+        <w:rPr>
+          <w:rFonts w:eastAsia="Arial" w:cs="Arial"/>
+          <w:b/>
+          <w:bCs/>
+          <w:color w:val="2980B9"/>
+          <w:sz w:val="24"/>
+          <w:szCs w:val="24"/>
+        </w:rPr>
+      </w:pPr>
+      <w:r>
+        <w:rPr>
+          <w:rFonts w:eastAsia="Arial" w:cs="Arial"/>
+          <w:b/>
+          <w:bCs/>
+          <w:color w:val="2980B9"/>
+          <w:sz w:val="24"/>
+          <w:szCs w:val="24"/>
+        </w:rPr>
+      </w:r>
+    </w:p>
+    <w:p>
+      <w:pPr>
+        <w:pStyle w:val="Heading2"/>
+        <w:spacing w:before="320" w:after="120"/>
+        <w:rPr>
+          <w:rFonts w:eastAsia="Arial" w:cs="Arial"/>
+          <w:b/>
+          <w:bCs/>
+          <w:color w:val="2980B9"/>
+          <w:sz w:val="24"/>
+          <w:szCs w:val="24"/>
+        </w:rPr>
+      </w:pPr>
+      <w:r>
+        <w:rPr>
+          <w:rFonts w:eastAsia="Arial" w:cs="Arial"/>
+          <w:b/>
+          <w:bCs/>
+          <w:color w:val="2980B9"/>
+          <w:sz w:val="24"/>
+          <w:szCs w:val="24"/>
+        </w:rPr>
+      </w:r>
+    </w:p>
+    <w:p>
+      <w:pPr>
+        <w:pStyle w:val="Heading2"/>
+        <w:spacing w:before="320" w:after="120"/>
+        <w:rPr>
+          <w:rFonts w:eastAsia="Arial" w:cs="Arial"/>
+          <w:b/>
+          <w:bCs/>
+          <w:color w:val="2980B9"/>
+          <w:sz w:val="24"/>
+          <w:szCs w:val="24"/>
+        </w:rPr>
+      </w:pPr>
+      <w:r>
+        <w:rPr>
+          <w:rFonts w:eastAsia="Arial" w:cs="Arial"/>
+          <w:b/>
+          <w:bCs/>
+          <w:color w:val="2980B9"/>
+          <w:sz w:val="24"/>
+          <w:szCs w:val="24"/>
+        </w:rPr>
+      </w:r>
+    </w:p>
+    <w:p>
+      <w:pPr>
+        <w:pStyle w:val="Heading2"/>
+        <w:spacing w:before="320" w:after="120"/>
+        <w:rPr>
+          <w:rFonts w:eastAsia="Arial" w:cs="Arial"/>
+          <w:b/>
+          <w:bCs/>
+          <w:color w:val="2980B9"/>
+          <w:sz w:val="24"/>
+          <w:szCs w:val="24"/>
+        </w:rPr>
+      </w:pPr>
+      <w:r>
+        <w:rPr>
+          <w:rFonts w:eastAsia="Arial" w:cs="Arial"/>
+          <w:b/>
+          <w:bCs/>
+          <w:color w:val="2980B9"/>
+          <w:sz w:val="24"/>
+          <w:szCs w:val="24"/>
+        </w:rPr>
         <w:t>Sorgu 5 — Müşteri Bazlı Toplam Ciro</w:t>
       </w:r>
     </w:p>
@@ -3215,7 +3135,7 @@
           <w:sz w:val="22"/>
           <w:szCs w:val="22"/>
         </w:rPr>
-        <w:t>[ Ekran Görüntüsü: Sorgu 5 Sonucu ]</w:t>
+        <w:t>Sorgu 5 Sonucu</w:t>
       </w:r>
     </w:p>
     <w:p>
@@ -3249,7 +3169,7 @@
           <w:szCs w:val="22"/>
         </w:rPr>
         <w:drawing>
-          <wp:anchor distT="0" distB="0" distL="0" distR="0" simplePos="0" relativeHeight="6" behindDoc="0" locked="0" layoutInCell="0" allowOverlap="1">
+          <wp:anchor distT="0" distB="0" distL="0" distR="0" simplePos="0" relativeHeight="5" behindDoc="0" locked="0" layoutInCell="0" allowOverlap="1">
             <wp:simplePos x="0" y="0"/>
             <wp:positionH relativeFrom="column">
               <wp:posOffset>1365885</wp:posOffset>
@@ -3477,6 +3397,10 @@
     <w:p>
       <w:pPr>
         <w:pStyle w:val="Normal"/>
+        <w:numPr>
+          <w:ilvl w:val="0"/>
+          <w:numId w:val="1"/>
+        </w:numPr>
         <w:spacing w:before="80" w:after="120"/>
         <w:rPr/>
       </w:pPr>
@@ -3487,7 +3411,26 @@
           <w:sz w:val="22"/>
           <w:szCs w:val="22"/>
         </w:rPr>
-        <w:t>Her siparişin üzerinden kaç gün geçtiği hesaplanmaktadır. PostgreSQL'de tarih farkı doğrudan çıkarma işlemiyle elde edilir (T-SQL'deki DATEDIFF() yerine).</w:t>
+        <w:t>Her siparişin üzerinden kaç gün geçtiği hesaplanmaktadır. PostgreSQL'de tarih farkı doğrudan çıkarma işlemiyle elde edilir (T-</w:t>
+      </w:r>
+      <w:r>
+        <w:rPr>
+          <w:rFonts w:eastAsia="Arial" w:cs="Arial"/>
+          <w:color w:val="444444"/>
+          <w:sz w:val="22"/>
+          <w:szCs w:val="22"/>
+          <w:lang w:val="tr-TR"/>
+        </w:rPr>
+        <w:t>SQL'daki</w:t>
+      </w:r>
+      <w:r>
+        <w:rPr>
+          <w:rFonts w:eastAsia="Arial" w:cs="Arial"/>
+          <w:color w:val="444444"/>
+          <w:sz w:val="22"/>
+          <w:szCs w:val="22"/>
+        </w:rPr>
+        <w:t xml:space="preserve"> DATEDIFF() yerine).</w:t>
       </w:r>
     </w:p>
     <w:p>
@@ -3596,7 +3539,7 @@
           <w:sz w:val="22"/>
           <w:szCs w:val="22"/>
         </w:rPr>
-        <w:t>[ Ekran Görüntüsü: Sorgu 6 Sonucu ]</w:t>
+        <w:t>Sorgu 6 Sonucu</w:t>
       </w:r>
     </w:p>
     <w:p>
@@ -3630,7 +3573,7 @@
           <w:szCs w:val="22"/>
         </w:rPr>
         <w:drawing>
-          <wp:anchor distT="0" distB="0" distL="0" distR="0" simplePos="0" relativeHeight="7" behindDoc="0" locked="0" layoutInCell="0" allowOverlap="1">
+          <wp:anchor distT="0" distB="0" distL="0" distR="0" simplePos="0" relativeHeight="6" behindDoc="0" locked="0" layoutInCell="0" allowOverlap="1">
             <wp:simplePos x="0" y="0"/>
             <wp:positionH relativeFrom="column">
               <wp:posOffset>491490</wp:posOffset>
@@ -4182,7 +4125,7 @@
           <w:sz w:val="22"/>
           <w:szCs w:val="22"/>
         </w:rPr>
-        <w:t>[ Ekran Görüntüsü: vw_OrderSummary Sorgu Sonucu ]</w:t>
+        <w:t>vw_OrderSummary Sorgu Sonucu</w:t>
       </w:r>
     </w:p>
     <w:p>
@@ -4216,7 +4159,7 @@
           <w:szCs w:val="22"/>
         </w:rPr>
         <w:drawing>
-          <wp:anchor distT="0" distB="0" distL="0" distR="0" simplePos="0" relativeHeight="8" behindDoc="0" locked="0" layoutInCell="0" allowOverlap="1">
+          <wp:anchor distT="0" distB="0" distL="0" distR="0" simplePos="0" relativeHeight="7" behindDoc="0" locked="0" layoutInCell="0" allowOverlap="1">
             <wp:simplePos x="0" y="0"/>
             <wp:positionH relativeFrom="column">
               <wp:posOffset>53340</wp:posOffset>
@@ -4294,7 +4237,26 @@
           <w:sz w:val="22"/>
           <w:szCs w:val="22"/>
         </w:rPr>
-        <w:t>Proje T-SQL yerine PostgreSQL üzerinde geliştirildiğinden, yedekleme pg_dump komutuyla gerçekleştirilmektedir. Ayrıca Linux sunucusunda bir cron job kurulmuş olup veritabanı her gün otomatik olarak yedeklenmektedir.</w:t>
+        <w:t xml:space="preserve">Proje T-SQL yerine PostgreSQL üzerinde geliştirildiğinden, yedekleme pg_dump komutuyla gerçekleştirilmektedir. Ayrıca </w:t>
+      </w:r>
+      <w:r>
+        <w:rPr>
+          <w:rFonts w:eastAsia="Arial" w:cs="Arial"/>
+          <w:color w:val="444444"/>
+          <w:sz w:val="22"/>
+          <w:szCs w:val="22"/>
+          <w:lang w:val="tr-TR"/>
+        </w:rPr>
+        <w:t xml:space="preserve">bir </w:t>
+      </w:r>
+      <w:r>
+        <w:rPr>
+          <w:rFonts w:eastAsia="Arial" w:cs="Arial"/>
+          <w:color w:val="444444"/>
+          <w:sz w:val="22"/>
+          <w:szCs w:val="22"/>
+        </w:rPr>
+        <w:t>Linux sunucusunda cron job kurulmuş olup veritabanı her gün otomatik olarak yedeklenmektedir.</w:t>
       </w:r>
     </w:p>
     <w:p>
@@ -4421,7 +4383,26 @@
           <w:sz w:val="22"/>
           <w:szCs w:val="22"/>
         </w:rPr>
-        <w:t>Shell script özel bir yedekleme scriptidir; tarihli dosya adları ve log kaydı içermektedir.</w:t>
+        <w:t xml:space="preserve">Shell script özel </w:t>
+      </w:r>
+      <w:r>
+        <w:rPr>
+          <w:rFonts w:eastAsia="Arial" w:cs="Arial"/>
+          <w:color w:val="444444"/>
+          <w:sz w:val="22"/>
+          <w:szCs w:val="22"/>
+          <w:lang w:val="tr-TR"/>
+        </w:rPr>
+        <w:t xml:space="preserve">olarak yazılmış </w:t>
+      </w:r>
+      <w:r>
+        <w:rPr>
+          <w:rFonts w:eastAsia="Arial" w:cs="Arial"/>
+          <w:color w:val="444444"/>
+          <w:sz w:val="22"/>
+          <w:szCs w:val="22"/>
+        </w:rPr>
+        <w:t>bir yedekleme scriptidir; tarihli dosya adları ve log kaydı içermektedir.</w:t>
       </w:r>
     </w:p>
     <w:p>
@@ -4451,11 +4432,23 @@
       </w:pPr>
       <w:r>
         <w:rPr/>
-        <w:t>FILE="novastore_backup_$(date +%Y%m%d_%H%M%S).sql" /usr/bin/pg_dump novastoredb &gt; /home/ugur/novastorebackupdir/$FILE &amp;&amp; scp /home/ugur/novastorebackupdir/$FILE ugur@19</w:t>
-      </w:r>
-      <w:r>
-        <w:rPr/>
-        <w:t>2.168.1.x:C:/path/to/backupdir/novastoredbbackups</w:t>
+        <w:t>FILE="novastore_backup_$(date +%Y%m%d_%H%M%S).sql" /usr/bin/pg_dump novastoredb &gt; /home/ugur/novastorebackupdir/$FILE &amp;&amp; scp /home/ugur/novastorebackupdir/$FILE ugur@192.168.1.x:C:/path/to/</w:t>
+      </w:r>
+      <w:r>
+        <w:rPr>
+          <w:lang w:val="tr-TR"/>
+        </w:rPr>
+        <w:t>backup</w:t>
+      </w:r>
+      <w:r>
+        <w:rPr/>
+        <w:t>/</w:t>
+      </w:r>
+      <w:r>
+        <w:rPr>
+          <w:lang w:val="tr-TR"/>
+        </w:rPr>
+        <w:t>folder</w:t>
       </w:r>
     </w:p>
     <w:p>
@@ -4479,6 +4472,255 @@
     </w:sectPr>
   </w:body>
 </w:document>
+</file>
+
+<file path=word/numbering.xml><?xml version="1.0" encoding="utf-8"?>
+<w:numbering xmlns:w="http://schemas.openxmlformats.org/wordprocessingml/2006/main" xmlns:o="urn:schemas-microsoft-com:office:office" xmlns:r="http://schemas.openxmlformats.org/officeDocument/2006/relationships" xmlns:v="urn:schemas-microsoft-com:vml" xmlns:mc="http://schemas.openxmlformats.org/markup-compatibility/2006" xmlns:w14="http://schemas.microsoft.com/office/word/2010/wordml" mc:Ignorable="w14">
+  <w:abstractNum w:abstractNumId="1">
+    <w:lvl w:ilvl="0">
+      <w:start w:val="1"/>
+      <w:numFmt w:val="decimal"/>
+      <w:lvlText w:val="%1."/>
+      <w:lvlJc w:val="start"/>
+      <w:pPr>
+        <w:tabs>
+          <w:tab w:val="num" w:pos="720"/>
+        </w:tabs>
+        <w:ind w:start="720" w:hanging="360"/>
+      </w:pPr>
+      <w:rPr/>
+    </w:lvl>
+    <w:lvl w:ilvl="1">
+      <w:start w:val="1"/>
+      <w:numFmt w:val="decimal"/>
+      <w:lvlText w:val="%2."/>
+      <w:lvlJc w:val="start"/>
+      <w:pPr>
+        <w:tabs>
+          <w:tab w:val="num" w:pos="1080"/>
+        </w:tabs>
+        <w:ind w:start="1080" w:hanging="360"/>
+      </w:pPr>
+      <w:rPr/>
+    </w:lvl>
+    <w:lvl w:ilvl="2">
+      <w:start w:val="1"/>
+      <w:numFmt w:val="decimal"/>
+      <w:lvlText w:val="%3."/>
+      <w:lvlJc w:val="start"/>
+      <w:pPr>
+        <w:tabs>
+          <w:tab w:val="num" w:pos="1440"/>
+        </w:tabs>
+        <w:ind w:start="1440" w:hanging="360"/>
+      </w:pPr>
+      <w:rPr/>
+    </w:lvl>
+    <w:lvl w:ilvl="3">
+      <w:start w:val="1"/>
+      <w:numFmt w:val="decimal"/>
+      <w:lvlText w:val="%4."/>
+      <w:lvlJc w:val="start"/>
+      <w:pPr>
+        <w:tabs>
+          <w:tab w:val="num" w:pos="1800"/>
+        </w:tabs>
+        <w:ind w:start="1800" w:hanging="360"/>
+      </w:pPr>
+      <w:rPr/>
+    </w:lvl>
+    <w:lvl w:ilvl="4">
+      <w:start w:val="1"/>
+      <w:numFmt w:val="decimal"/>
+      <w:lvlText w:val="%5."/>
+      <w:lvlJc w:val="start"/>
+      <w:pPr>
+        <w:tabs>
+          <w:tab w:val="num" w:pos="2160"/>
+        </w:tabs>
+        <w:ind w:start="2160" w:hanging="360"/>
+      </w:pPr>
+      <w:rPr/>
+    </w:lvl>
+    <w:lvl w:ilvl="5">
+      <w:start w:val="1"/>
+      <w:numFmt w:val="decimal"/>
+      <w:lvlText w:val="%6."/>
+      <w:lvlJc w:val="start"/>
+      <w:pPr>
+        <w:tabs>
+          <w:tab w:val="num" w:pos="2520"/>
+        </w:tabs>
+        <w:ind w:start="2520" w:hanging="360"/>
+      </w:pPr>
+      <w:rPr/>
+    </w:lvl>
+    <w:lvl w:ilvl="6">
+      <w:start w:val="1"/>
+      <w:numFmt w:val="decimal"/>
+      <w:lvlText w:val="%7."/>
+      <w:lvlJc w:val="start"/>
+      <w:pPr>
+        <w:tabs>
+          <w:tab w:val="num" w:pos="2880"/>
+        </w:tabs>
+        <w:ind w:start="2880" w:hanging="360"/>
+      </w:pPr>
+      <w:rPr/>
+    </w:lvl>
+    <w:lvl w:ilvl="7">
+      <w:start w:val="1"/>
+      <w:numFmt w:val="decimal"/>
+      <w:lvlText w:val="%8."/>
+      <w:lvlJc w:val="start"/>
+      <w:pPr>
+        <w:tabs>
+          <w:tab w:val="num" w:pos="3240"/>
+        </w:tabs>
+        <w:ind w:start="3240" w:hanging="360"/>
+      </w:pPr>
+      <w:rPr/>
+    </w:lvl>
+    <w:lvl w:ilvl="8">
+      <w:start w:val="1"/>
+      <w:numFmt w:val="decimal"/>
+      <w:lvlText w:val="%9."/>
+      <w:lvlJc w:val="start"/>
+      <w:pPr>
+        <w:tabs>
+          <w:tab w:val="num" w:pos="3600"/>
+        </w:tabs>
+        <w:ind w:start="3600" w:hanging="360"/>
+      </w:pPr>
+      <w:rPr/>
+    </w:lvl>
+  </w:abstractNum>
+  <w:abstractNum w:abstractNumId="2">
+    <w:lvl w:ilvl="0">
+      <w:start w:val="1"/>
+      <w:numFmt w:val="none"/>
+      <w:suff w:val="nothing"/>
+      <w:lvlText w:val=""/>
+      <w:lvlJc w:val="start"/>
+      <w:pPr>
+        <w:tabs>
+          <w:tab w:val="num" w:pos="0"/>
+        </w:tabs>
+        <w:ind w:start="0" w:hanging="0"/>
+      </w:pPr>
+    </w:lvl>
+    <w:lvl w:ilvl="1">
+      <w:start w:val="1"/>
+      <w:numFmt w:val="none"/>
+      <w:suff w:val="nothing"/>
+      <w:lvlText w:val=""/>
+      <w:lvlJc w:val="start"/>
+      <w:pPr>
+        <w:tabs>
+          <w:tab w:val="num" w:pos="0"/>
+        </w:tabs>
+        <w:ind w:start="0" w:hanging="0"/>
+      </w:pPr>
+    </w:lvl>
+    <w:lvl w:ilvl="2">
+      <w:start w:val="1"/>
+      <w:numFmt w:val="none"/>
+      <w:suff w:val="nothing"/>
+      <w:lvlText w:val=""/>
+      <w:lvlJc w:val="start"/>
+      <w:pPr>
+        <w:tabs>
+          <w:tab w:val="num" w:pos="0"/>
+        </w:tabs>
+        <w:ind w:start="0" w:hanging="0"/>
+      </w:pPr>
+    </w:lvl>
+    <w:lvl w:ilvl="3">
+      <w:start w:val="1"/>
+      <w:numFmt w:val="none"/>
+      <w:suff w:val="nothing"/>
+      <w:lvlText w:val=""/>
+      <w:lvlJc w:val="start"/>
+      <w:pPr>
+        <w:tabs>
+          <w:tab w:val="num" w:pos="0"/>
+        </w:tabs>
+        <w:ind w:start="0" w:hanging="0"/>
+      </w:pPr>
+    </w:lvl>
+    <w:lvl w:ilvl="4">
+      <w:start w:val="1"/>
+      <w:numFmt w:val="none"/>
+      <w:suff w:val="nothing"/>
+      <w:lvlText w:val=""/>
+      <w:lvlJc w:val="start"/>
+      <w:pPr>
+        <w:tabs>
+          <w:tab w:val="num" w:pos="0"/>
+        </w:tabs>
+        <w:ind w:start="0" w:hanging="0"/>
+      </w:pPr>
+    </w:lvl>
+    <w:lvl w:ilvl="5">
+      <w:start w:val="1"/>
+      <w:numFmt w:val="none"/>
+      <w:suff w:val="nothing"/>
+      <w:lvlText w:val=""/>
+      <w:lvlJc w:val="start"/>
+      <w:pPr>
+        <w:tabs>
+          <w:tab w:val="num" w:pos="0"/>
+        </w:tabs>
+        <w:ind w:start="0" w:hanging="0"/>
+      </w:pPr>
+    </w:lvl>
+    <w:lvl w:ilvl="6">
+      <w:start w:val="1"/>
+      <w:numFmt w:val="none"/>
+      <w:suff w:val="nothing"/>
+      <w:lvlText w:val=""/>
+      <w:lvlJc w:val="start"/>
+      <w:pPr>
+        <w:tabs>
+          <w:tab w:val="num" w:pos="0"/>
+        </w:tabs>
+        <w:ind w:start="0" w:hanging="0"/>
+      </w:pPr>
+    </w:lvl>
+    <w:lvl w:ilvl="7">
+      <w:start w:val="1"/>
+      <w:numFmt w:val="none"/>
+      <w:suff w:val="nothing"/>
+      <w:lvlText w:val=""/>
+      <w:lvlJc w:val="start"/>
+      <w:pPr>
+        <w:tabs>
+          <w:tab w:val="num" w:pos="0"/>
+        </w:tabs>
+        <w:ind w:start="0" w:hanging="0"/>
+      </w:pPr>
+    </w:lvl>
+    <w:lvl w:ilvl="8">
+      <w:start w:val="1"/>
+      <w:numFmt w:val="none"/>
+      <w:suff w:val="nothing"/>
+      <w:lvlText w:val=""/>
+      <w:lvlJc w:val="start"/>
+      <w:pPr>
+        <w:tabs>
+          <w:tab w:val="num" w:pos="0"/>
+        </w:tabs>
+        <w:ind w:start="0" w:hanging="0"/>
+      </w:pPr>
+    </w:lvl>
+  </w:abstractNum>
+  <w:num w:numId="1">
+    <w:abstractNumId w:val="1"/>
+  </w:num>
+  <w:num w:numId="2">
+    <w:abstractNumId w:val="2"/>
+  </w:num>
+</w:numbering>
 </file>
 
 <file path=word/styles.xml><?xml version="1.0" encoding="utf-8"?>
@@ -4669,6 +4911,11 @@
       <w:sz w:val="20"/>
       <w:szCs w:val="20"/>
     </w:rPr>
+  </w:style>
+  <w:style w:type="character" w:styleId="NumberingSymbols">
+    <w:name w:val="Numbering Symbols"/>
+    <w:qFormat/>
+    <w:rPr/>
   </w:style>
   <w:style w:type="paragraph" w:styleId="Heading">
     <w:name w:val="Heading"/>

</xml_diff>